<commit_message>
docs(resume): update professional experience details for clarity and impact
</commit_message>
<xml_diff>
--- a/Career/Resume/Resume-ATS-Master.docx
+++ b/Career/Resume/Resume-ATS-Master.docx
@@ -563,7 +563,42 @@
           <w:sz w:val="21"/>
           <w:szCs w:val="21"/>
         </w:rPr>
-        <w:t>Processed hundreds of customer packages per shift across multiple sortation paths while maintaining accuracy and productivity standards.</w:t>
+        <w:t>I processed up to 900+ of customer packages, on Inbound Dock, per shift across multiple sortation paths while maintaining accuracy and productivity standards.</w:t>
+      </w:r>
+      <w:r>
+        <w:rPr>
+          <w:rFonts w:ascii="Calibri" w:eastAsia="Calibri" w:hAnsi="Calibri" w:cs="Calibri"/>
+          <w:color w:val="000000"/>
+          <w:sz w:val="21"/>
+          <w:szCs w:val="21"/>
+        </w:rPr>
+        <w:t xml:space="preserve"> </w:t>
+      </w:r>
+    </w:p>
+    <w:p>
+      <w:pPr>
+        <w:pStyle w:val="ListParagraph"/>
+        <w:numPr>
+          <w:ilvl w:val="0"/>
+          <w:numId w:val="2"/>
+        </w:numPr>
+        <w:shd w:val="clear" w:color="auto" w:fill="FFFFFF"/>
+        <w:spacing w:line="285" w:lineRule="atLeast"/>
+        <w:rPr>
+          <w:rFonts w:ascii="Calibri" w:hAnsi="Calibri" w:cs="Calibri"/>
+          <w:color w:val="202020"/>
+          <w:sz w:val="21"/>
+          <w:szCs w:val="21"/>
+        </w:rPr>
+      </w:pPr>
+      <w:r>
+        <w:rPr>
+          <w:rFonts w:ascii="Calibri" w:hAnsi="Calibri" w:cs="Calibri"/>
+          <w:color w:val="202020"/>
+          <w:sz w:val="21"/>
+          <w:szCs w:val="21"/>
+        </w:rPr>
+        <w:t>I operated handheld scanning technology and warehouse systems, on HIPPO Area, to track and stage shipments with minimal errors, kept a scan rate of 250+ packages every 15 minutes.</w:t>
       </w:r>
     </w:p>
     <w:p>
@@ -582,7 +617,47 @@
           <w:sz w:val="21"/>
           <w:szCs w:val="21"/>
         </w:rPr>
-        <w:t>Operated handheld scanning technology and warehouse systems to track and stage shipments with minimal errors.</w:t>
+        <w:t>I a</w:t>
+      </w:r>
+      <w:r>
+        <w:rPr>
+          <w:rFonts w:ascii="Calibri" w:eastAsia="Calibri" w:hAnsi="Calibri" w:cs="Calibri"/>
+          <w:color w:val="000000"/>
+          <w:sz w:val="21"/>
+          <w:szCs w:val="21"/>
+        </w:rPr>
+        <w:t>dapted quickly to shifting priorities and extended shifts, consistently meeting performance targets in a fast-paced fulfillment environment.</w:t>
+      </w:r>
+    </w:p>
+    <w:p>
+      <w:pPr>
+        <w:tabs>
+          <w:tab w:val="right" w:pos="9350"/>
+        </w:tabs>
+        <w:spacing w:before="90" w:after="10"/>
+      </w:pPr>
+      <w:r>
+        <w:rPr>
+          <w:rFonts w:ascii="Calibri" w:eastAsia="Calibri" w:hAnsi="Calibri" w:cs="Calibri"/>
+          <w:b/>
+          <w:bCs/>
+          <w:color w:val="000000"/>
+          <w:sz w:val="21"/>
+          <w:szCs w:val="21"/>
+        </w:rPr>
+        <w:t>Machine Operator — Coca-Cola Beverages Florida, Auburndale, FL</w:t>
+      </w:r>
+      <w:r>
+        <w:rPr>
+          <w:rFonts w:ascii="Calibri" w:eastAsia="Calibri" w:hAnsi="Calibri" w:cs="Calibri"/>
+          <w:i/>
+          <w:iCs/>
+          <w:color w:val="000000"/>
+          <w:sz w:val="19"/>
+          <w:szCs w:val="19"/>
+        </w:rPr>
+        <w:tab/>
+        <w:t>Jul 2025 – Oct 2025</w:t>
       </w:r>
     </w:p>
     <w:p>
@@ -601,38 +676,16 @@
           <w:sz w:val="21"/>
           <w:szCs w:val="21"/>
         </w:rPr>
-        <w:t>Adapted quickly to shifting priorities and extended shifts, consistently meeting performance targets in a fast-paced fulfillment environment.</w:t>
-      </w:r>
-    </w:p>
-    <w:p>
-      <w:pPr>
-        <w:tabs>
-          <w:tab w:val="right" w:pos="9350"/>
-        </w:tabs>
-        <w:spacing w:before="90" w:after="10"/>
-      </w:pPr>
-      <w:r>
-        <w:rPr>
-          <w:rFonts w:ascii="Calibri" w:eastAsia="Calibri" w:hAnsi="Calibri" w:cs="Calibri"/>
-          <w:b/>
-          <w:bCs/>
-          <w:color w:val="000000"/>
-          <w:sz w:val="21"/>
-          <w:szCs w:val="21"/>
-        </w:rPr>
-        <w:t>Machine Operator — Coca-Cola Beverages Florida, Auburndale, FL</w:t>
-      </w:r>
-      <w:r>
-        <w:rPr>
-          <w:rFonts w:ascii="Calibri" w:eastAsia="Calibri" w:hAnsi="Calibri" w:cs="Calibri"/>
-          <w:i/>
-          <w:iCs/>
-          <w:color w:val="000000"/>
-          <w:sz w:val="19"/>
-          <w:szCs w:val="19"/>
-        </w:rPr>
-        <w:tab/>
-        <w:t>Jul 2025 – Oct 2025</w:t>
+        <w:t>I o</w:t>
+      </w:r>
+      <w:r>
+        <w:rPr>
+          <w:rFonts w:ascii="Calibri" w:eastAsia="Calibri" w:hAnsi="Calibri" w:cs="Calibri"/>
+          <w:color w:val="000000"/>
+          <w:sz w:val="21"/>
+          <w:szCs w:val="21"/>
+        </w:rPr>
+        <w:t>perated production equipment while performing quality and safety inspections that supported continuous, safe production output.</w:t>
       </w:r>
     </w:p>
     <w:p>
@@ -651,7 +704,16 @@
           <w:sz w:val="21"/>
           <w:szCs w:val="21"/>
         </w:rPr>
-        <w:t>Operated production equipment while performing quality and safety inspections that supported continuous, safe production output.</w:t>
+        <w:t>I i</w:t>
+      </w:r>
+      <w:r>
+        <w:rPr>
+          <w:rFonts w:ascii="Calibri" w:eastAsia="Calibri" w:hAnsi="Calibri" w:cs="Calibri"/>
+          <w:color w:val="000000"/>
+          <w:sz w:val="21"/>
+          <w:szCs w:val="21"/>
+        </w:rPr>
+        <w:t>dentified and addressed equipment issues during shifts, helping maintain consistent production flow.</w:t>
       </w:r>
     </w:p>
     <w:p>
@@ -670,26 +732,34 @@
           <w:sz w:val="21"/>
           <w:szCs w:val="21"/>
         </w:rPr>
-        <w:t>Identified and addressed equipment issues during shifts, helping maintain consistent production flow.</w:t>
-      </w:r>
-    </w:p>
-    <w:p>
-      <w:pPr>
-        <w:pStyle w:val="ListParagraph"/>
-        <w:numPr>
-          <w:ilvl w:val="0"/>
-          <w:numId w:val="2"/>
-        </w:numPr>
-        <w:spacing w:after="30"/>
-      </w:pPr>
-      <w:r>
-        <w:rPr>
-          <w:rFonts w:ascii="Calibri" w:eastAsia="Calibri" w:hAnsi="Calibri" w:cs="Calibri"/>
-          <w:color w:val="000000"/>
-          <w:sz w:val="21"/>
-          <w:szCs w:val="21"/>
-        </w:rPr>
-        <w:t>Maintained an organized, safety-compliant work area while collaborating with a team under physically demanding conditions.</w:t>
+        <w:t>I always kept a m</w:t>
+      </w:r>
+      <w:r>
+        <w:rPr>
+          <w:rFonts w:ascii="Calibri" w:eastAsia="Calibri" w:hAnsi="Calibri" w:cs="Calibri"/>
+          <w:color w:val="000000"/>
+          <w:sz w:val="21"/>
+          <w:szCs w:val="21"/>
+        </w:rPr>
+        <w:t>aintained</w:t>
+      </w:r>
+      <w:r>
+        <w:rPr>
+          <w:rFonts w:ascii="Calibri" w:eastAsia="Calibri" w:hAnsi="Calibri" w:cs="Calibri"/>
+          <w:color w:val="000000"/>
+          <w:sz w:val="21"/>
+          <w:szCs w:val="21"/>
+        </w:rPr>
+        <w:t xml:space="preserve">, </w:t>
+      </w:r>
+      <w:r>
+        <w:rPr>
+          <w:rFonts w:ascii="Calibri" w:eastAsia="Calibri" w:hAnsi="Calibri" w:cs="Calibri"/>
+          <w:color w:val="000000"/>
+          <w:sz w:val="21"/>
+          <w:szCs w:val="21"/>
+        </w:rPr>
+        <w:t>organized, safety-compliant work area while collaborating with a team under physically demanding conditions.</w:t>
       </w:r>
     </w:p>
     <w:sectPr>
@@ -1339,7 +1409,6 @@
   <w:style w:type="character" w:default="1" w:styleId="DefaultParagraphFont">
     <w:name w:val="Default Paragraph Font"/>
     <w:uiPriority w:val="1"/>
-    <w:semiHidden/>
     <w:unhideWhenUsed/>
   </w:style>
   <w:style w:type="table" w:default="1" w:styleId="TableNormal">

</xml_diff>